<commit_message>
Improve custom style views
</commit_message>
<xml_diff>
--- a/templates/review-responses-template.docx
+++ b/templates/review-responses-template.docx
@@ -1,13 +1,11 @@
 
 <file path=word/document.xml><?xml version="1.0" encoding="utf-8"?>
-<w:document xmlns:wpc="http://schemas.microsoft.com/office/word/2010/wordprocessingCanvas" xmlns:cx="http://schemas.microsoft.com/office/drawing/2014/chartex" xmlns:cx1="http://schemas.microsoft.com/office/drawing/2015/9/8/chartex" xmlns:cx2="http://schemas.microsoft.com/office/drawing/2015/10/21/chartex" xmlns:cx3="http://schemas.microsoft.com/office/drawing/2016/5/9/chartex" xmlns:cx4="http://schemas.microsoft.com/office/drawing/2016/5/10/chartex" xmlns:cx5="http://schemas.microsoft.com/office/drawing/2016/5/11/chartex" xmlns:cx6="http://schemas.microsoft.com/office/drawing/2016/5/12/chartex" xmlns:cx7="http://schemas.microsoft.com/office/drawing/2016/5/13/chartex" xmlns:cx8="http://schemas.microsoft.com/office/drawing/2016/5/14/chartex" xmlns:mc="http://schemas.openxmlformats.org/markup-compatibility/2006" xmlns:aink="http://schemas.microsoft.com/office/drawing/2016/ink" xmlns:am3d="http://schemas.microsoft.com/office/drawing/2017/model3d" xmlns:o="urn:schemas-microsoft-com:office:office" xmlns:r="http://schemas.openxmlformats.org/officeDocument/2006/relationships" xmlns:m="http://schemas.openxmlformats.org/officeDocument/2006/math" xmlns:v="urn:schemas-microsoft-com:vml" xmlns:wp14="http://schemas.microsoft.com/office/word/2010/wordprocessingDrawing" xmlns:wp="http://schemas.openxmlformats.org/drawingml/2006/wordprocessingDrawing" xmlns:w10="urn:schemas-microsoft-com:office:word" xmlns:w="http://schemas.openxmlformats.org/wordprocessingml/2006/main" xmlns:w14="http://schemas.microsoft.com/office/word/2010/wordml" xmlns:w15="http://schemas.microsoft.com/office/word/2012/wordml" xmlns:w16cid="http://schemas.microsoft.com/office/word/2016/wordml/cid" xmlns:w16se="http://schemas.microsoft.com/office/word/2015/wordml/symex" xmlns:wpg="http://schemas.microsoft.com/office/word/2010/wordprocessingGroup" xmlns:wpi="http://schemas.microsoft.com/office/word/2010/wordprocessingInk" xmlns:wne="http://schemas.microsoft.com/office/word/2006/wordml" xmlns:wps="http://schemas.microsoft.com/office/word/2010/wordprocessingShape" mc:Ignorable="w14 w15 w16se w16cid wp14">
+<w:document xmlns:wpc="http://schemas.microsoft.com/office/word/2010/wordprocessingCanvas" xmlns:cx="http://schemas.microsoft.com/office/drawing/2014/chartex" xmlns:cx1="http://schemas.microsoft.com/office/drawing/2015/9/8/chartex" xmlns:cx2="http://schemas.microsoft.com/office/drawing/2015/10/21/chartex" xmlns:cx3="http://schemas.microsoft.com/office/drawing/2016/5/9/chartex" xmlns:cx4="http://schemas.microsoft.com/office/drawing/2016/5/10/chartex" xmlns:cx5="http://schemas.microsoft.com/office/drawing/2016/5/11/chartex" xmlns:cx6="http://schemas.microsoft.com/office/drawing/2016/5/12/chartex" xmlns:cx7="http://schemas.microsoft.com/office/drawing/2016/5/13/chartex" xmlns:cx8="http://schemas.microsoft.com/office/drawing/2016/5/14/chartex" xmlns:mc="http://schemas.openxmlformats.org/markup-compatibility/2006" xmlns:aink="http://schemas.microsoft.com/office/drawing/2016/ink" xmlns:am3d="http://schemas.microsoft.com/office/drawing/2017/model3d" xmlns:o="urn:schemas-microsoft-com:office:office" xmlns:oel="http://schemas.microsoft.com/office/2019/extlst" xmlns:r="http://schemas.openxmlformats.org/officeDocument/2006/relationships" xmlns:m="http://schemas.openxmlformats.org/officeDocument/2006/math" xmlns:v="urn:schemas-microsoft-com:vml" xmlns:wp14="http://schemas.microsoft.com/office/word/2010/wordprocessingDrawing" xmlns:wp="http://schemas.openxmlformats.org/drawingml/2006/wordprocessingDrawing" xmlns:w10="urn:schemas-microsoft-com:office:word" xmlns:w="http://schemas.openxmlformats.org/wordprocessingml/2006/main" xmlns:w14="http://schemas.microsoft.com/office/word/2010/wordml" xmlns:w15="http://schemas.microsoft.com/office/word/2012/wordml" xmlns:w16cex="http://schemas.microsoft.com/office/word/2018/wordml/cex" xmlns:w16cid="http://schemas.microsoft.com/office/word/2016/wordml/cid" xmlns:w16="http://schemas.microsoft.com/office/word/2018/wordml" xmlns:w16du="http://schemas.microsoft.com/office/word/2023/wordml/word16du" xmlns:w16sdtdh="http://schemas.microsoft.com/office/word/2020/wordml/sdtdatahash" xmlns:w16sdtfl="http://schemas.microsoft.com/office/word/2024/wordml/sdtformatlock" xmlns:w16se="http://schemas.microsoft.com/office/word/2015/wordml/symex" xmlns:wpg="http://schemas.microsoft.com/office/word/2010/wordprocessingGroup" xmlns:wpi="http://schemas.microsoft.com/office/word/2010/wordprocessingInk" xmlns:wne="http://schemas.microsoft.com/office/word/2006/wordml" xmlns:wps="http://schemas.microsoft.com/office/word/2010/wordprocessingShape" mc:Ignorable="w14 w15 w16se w16cid w16 w16cex w16sdtdh w16sdtfl w16du wp14">
   <w:body>
     <w:p>
       <w:pPr>
         <w:pStyle w:val="BodyText"/>
       </w:pPr>
-      <w:bookmarkStart w:id="0" w:name="_GoBack"/>
-      <w:bookmarkEnd w:id="0"/>
     </w:p>
     <w:sectPr>
       <w:pgSz w:w="12240" w:h="15840"/>
@@ -19,7 +17,7 @@
 </file>
 
 <file path=word/endnotes.xml><?xml version="1.0" encoding="utf-8"?>
-<w:endnotes xmlns:wpc="http://schemas.microsoft.com/office/word/2010/wordprocessingCanvas" xmlns:cx="http://schemas.microsoft.com/office/drawing/2014/chartex" xmlns:cx1="http://schemas.microsoft.com/office/drawing/2015/9/8/chartex" xmlns:cx2="http://schemas.microsoft.com/office/drawing/2015/10/21/chartex" xmlns:cx3="http://schemas.microsoft.com/office/drawing/2016/5/9/chartex" xmlns:cx4="http://schemas.microsoft.com/office/drawing/2016/5/10/chartex" xmlns:cx5="http://schemas.microsoft.com/office/drawing/2016/5/11/chartex" xmlns:cx6="http://schemas.microsoft.com/office/drawing/2016/5/12/chartex" xmlns:cx7="http://schemas.microsoft.com/office/drawing/2016/5/13/chartex" xmlns:cx8="http://schemas.microsoft.com/office/drawing/2016/5/14/chartex" xmlns:mc="http://schemas.openxmlformats.org/markup-compatibility/2006" xmlns:aink="http://schemas.microsoft.com/office/drawing/2016/ink" xmlns:am3d="http://schemas.microsoft.com/office/drawing/2017/model3d" xmlns:o="urn:schemas-microsoft-com:office:office" xmlns:r="http://schemas.openxmlformats.org/officeDocument/2006/relationships" xmlns:m="http://schemas.openxmlformats.org/officeDocument/2006/math" xmlns:v="urn:schemas-microsoft-com:vml" xmlns:wp14="http://schemas.microsoft.com/office/word/2010/wordprocessingDrawing" xmlns:wp="http://schemas.openxmlformats.org/drawingml/2006/wordprocessingDrawing" xmlns:w10="urn:schemas-microsoft-com:office:word" xmlns:w="http://schemas.openxmlformats.org/wordprocessingml/2006/main" xmlns:w14="http://schemas.microsoft.com/office/word/2010/wordml" xmlns:w15="http://schemas.microsoft.com/office/word/2012/wordml" xmlns:w16cid="http://schemas.microsoft.com/office/word/2016/wordml/cid" xmlns:w16se="http://schemas.microsoft.com/office/word/2015/wordml/symex" xmlns:wpg="http://schemas.microsoft.com/office/word/2010/wordprocessingGroup" xmlns:wpi="http://schemas.microsoft.com/office/word/2010/wordprocessingInk" xmlns:wne="http://schemas.microsoft.com/office/word/2006/wordml" xmlns:wps="http://schemas.microsoft.com/office/word/2010/wordprocessingShape" mc:Ignorable="w14 w15 w16se w16cid wp14">
+<w:endnotes xmlns:wpc="http://schemas.microsoft.com/office/word/2010/wordprocessingCanvas" xmlns:cx="http://schemas.microsoft.com/office/drawing/2014/chartex" xmlns:cx1="http://schemas.microsoft.com/office/drawing/2015/9/8/chartex" xmlns:cx2="http://schemas.microsoft.com/office/drawing/2015/10/21/chartex" xmlns:cx3="http://schemas.microsoft.com/office/drawing/2016/5/9/chartex" xmlns:cx4="http://schemas.microsoft.com/office/drawing/2016/5/10/chartex" xmlns:cx5="http://schemas.microsoft.com/office/drawing/2016/5/11/chartex" xmlns:cx6="http://schemas.microsoft.com/office/drawing/2016/5/12/chartex" xmlns:cx7="http://schemas.microsoft.com/office/drawing/2016/5/13/chartex" xmlns:cx8="http://schemas.microsoft.com/office/drawing/2016/5/14/chartex" xmlns:mc="http://schemas.openxmlformats.org/markup-compatibility/2006" xmlns:aink="http://schemas.microsoft.com/office/drawing/2016/ink" xmlns:am3d="http://schemas.microsoft.com/office/drawing/2017/model3d" xmlns:o="urn:schemas-microsoft-com:office:office" xmlns:oel="http://schemas.microsoft.com/office/2019/extlst" xmlns:r="http://schemas.openxmlformats.org/officeDocument/2006/relationships" xmlns:m="http://schemas.openxmlformats.org/officeDocument/2006/math" xmlns:v="urn:schemas-microsoft-com:vml" xmlns:wp14="http://schemas.microsoft.com/office/word/2010/wordprocessingDrawing" xmlns:wp="http://schemas.openxmlformats.org/drawingml/2006/wordprocessingDrawing" xmlns:w10="urn:schemas-microsoft-com:office:word" xmlns:w="http://schemas.openxmlformats.org/wordprocessingml/2006/main" xmlns:w14="http://schemas.microsoft.com/office/word/2010/wordml" xmlns:w15="http://schemas.microsoft.com/office/word/2012/wordml" xmlns:w16cex="http://schemas.microsoft.com/office/word/2018/wordml/cex" xmlns:w16cid="http://schemas.microsoft.com/office/word/2016/wordml/cid" xmlns:w16="http://schemas.microsoft.com/office/word/2018/wordml" xmlns:w16du="http://schemas.microsoft.com/office/word/2023/wordml/word16du" xmlns:w16sdtdh="http://schemas.microsoft.com/office/word/2020/wordml/sdtdatahash" xmlns:w16sdtfl="http://schemas.microsoft.com/office/word/2024/wordml/sdtformatlock" xmlns:w16se="http://schemas.microsoft.com/office/word/2015/wordml/symex" xmlns:wpg="http://schemas.microsoft.com/office/word/2010/wordprocessingGroup" xmlns:wpi="http://schemas.microsoft.com/office/word/2010/wordprocessingInk" xmlns:wne="http://schemas.microsoft.com/office/word/2006/wordml" xmlns:wps="http://schemas.microsoft.com/office/word/2010/wordprocessingShape" mc:Ignorable="w14 w15 w16se w16cid w16 w16cex w16sdtdh w16sdtfl w16du wp14">
   <w:endnote w:type="separator" w:id="-1">
     <w:p>
       <w:pPr>
@@ -44,7 +42,7 @@
 </file>
 
 <file path=word/footnotes.xml><?xml version="1.0" encoding="utf-8"?>
-<w:footnotes xmlns:wpc="http://schemas.microsoft.com/office/word/2010/wordprocessingCanvas" xmlns:cx="http://schemas.microsoft.com/office/drawing/2014/chartex" xmlns:cx1="http://schemas.microsoft.com/office/drawing/2015/9/8/chartex" xmlns:cx2="http://schemas.microsoft.com/office/drawing/2015/10/21/chartex" xmlns:cx3="http://schemas.microsoft.com/office/drawing/2016/5/9/chartex" xmlns:cx4="http://schemas.microsoft.com/office/drawing/2016/5/10/chartex" xmlns:cx5="http://schemas.microsoft.com/office/drawing/2016/5/11/chartex" xmlns:cx6="http://schemas.microsoft.com/office/drawing/2016/5/12/chartex" xmlns:cx7="http://schemas.microsoft.com/office/drawing/2016/5/13/chartex" xmlns:cx8="http://schemas.microsoft.com/office/drawing/2016/5/14/chartex" xmlns:mc="http://schemas.openxmlformats.org/markup-compatibility/2006" xmlns:aink="http://schemas.microsoft.com/office/drawing/2016/ink" xmlns:am3d="http://schemas.microsoft.com/office/drawing/2017/model3d" xmlns:o="urn:schemas-microsoft-com:office:office" xmlns:r="http://schemas.openxmlformats.org/officeDocument/2006/relationships" xmlns:m="http://schemas.openxmlformats.org/officeDocument/2006/math" xmlns:v="urn:schemas-microsoft-com:vml" xmlns:wp14="http://schemas.microsoft.com/office/word/2010/wordprocessingDrawing" xmlns:wp="http://schemas.openxmlformats.org/drawingml/2006/wordprocessingDrawing" xmlns:w10="urn:schemas-microsoft-com:office:word" xmlns:w="http://schemas.openxmlformats.org/wordprocessingml/2006/main" xmlns:w14="http://schemas.microsoft.com/office/word/2010/wordml" xmlns:w15="http://schemas.microsoft.com/office/word/2012/wordml" xmlns:w16cid="http://schemas.microsoft.com/office/word/2016/wordml/cid" xmlns:w16se="http://schemas.microsoft.com/office/word/2015/wordml/symex" xmlns:wpg="http://schemas.microsoft.com/office/word/2010/wordprocessingGroup" xmlns:wpi="http://schemas.microsoft.com/office/word/2010/wordprocessingInk" xmlns:wne="http://schemas.microsoft.com/office/word/2006/wordml" xmlns:wps="http://schemas.microsoft.com/office/word/2010/wordprocessingShape" mc:Ignorable="w14 w15 w16se w16cid wp14">
+<w:footnotes xmlns:wpc="http://schemas.microsoft.com/office/word/2010/wordprocessingCanvas" xmlns:cx="http://schemas.microsoft.com/office/drawing/2014/chartex" xmlns:cx1="http://schemas.microsoft.com/office/drawing/2015/9/8/chartex" xmlns:cx2="http://schemas.microsoft.com/office/drawing/2015/10/21/chartex" xmlns:cx3="http://schemas.microsoft.com/office/drawing/2016/5/9/chartex" xmlns:cx4="http://schemas.microsoft.com/office/drawing/2016/5/10/chartex" xmlns:cx5="http://schemas.microsoft.com/office/drawing/2016/5/11/chartex" xmlns:cx6="http://schemas.microsoft.com/office/drawing/2016/5/12/chartex" xmlns:cx7="http://schemas.microsoft.com/office/drawing/2016/5/13/chartex" xmlns:cx8="http://schemas.microsoft.com/office/drawing/2016/5/14/chartex" xmlns:mc="http://schemas.openxmlformats.org/markup-compatibility/2006" xmlns:aink="http://schemas.microsoft.com/office/drawing/2016/ink" xmlns:am3d="http://schemas.microsoft.com/office/drawing/2017/model3d" xmlns:o="urn:schemas-microsoft-com:office:office" xmlns:oel="http://schemas.microsoft.com/office/2019/extlst" xmlns:r="http://schemas.openxmlformats.org/officeDocument/2006/relationships" xmlns:m="http://schemas.openxmlformats.org/officeDocument/2006/math" xmlns:v="urn:schemas-microsoft-com:vml" xmlns:wp14="http://schemas.microsoft.com/office/word/2010/wordprocessingDrawing" xmlns:wp="http://schemas.openxmlformats.org/drawingml/2006/wordprocessingDrawing" xmlns:w10="urn:schemas-microsoft-com:office:word" xmlns:w="http://schemas.openxmlformats.org/wordprocessingml/2006/main" xmlns:w14="http://schemas.microsoft.com/office/word/2010/wordml" xmlns:w15="http://schemas.microsoft.com/office/word/2012/wordml" xmlns:w16cex="http://schemas.microsoft.com/office/word/2018/wordml/cex" xmlns:w16cid="http://schemas.microsoft.com/office/word/2016/wordml/cid" xmlns:w16="http://schemas.microsoft.com/office/word/2018/wordml" xmlns:w16du="http://schemas.microsoft.com/office/word/2023/wordml/word16du" xmlns:w16sdtdh="http://schemas.microsoft.com/office/word/2020/wordml/sdtdatahash" xmlns:w16sdtfl="http://schemas.microsoft.com/office/word/2024/wordml/sdtformatlock" xmlns:w16se="http://schemas.microsoft.com/office/word/2015/wordml/symex" xmlns:wpg="http://schemas.microsoft.com/office/word/2010/wordprocessingGroup" xmlns:wpi="http://schemas.microsoft.com/office/word/2010/wordprocessingInk" xmlns:wne="http://schemas.microsoft.com/office/word/2006/wordml" xmlns:wps="http://schemas.microsoft.com/office/word/2010/wordprocessingShape" mc:Ignorable="w14 w15 w16se w16cid w16 w16cex w16sdtdh w16sdtfl w16du wp14">
   <w:footnote w:type="separator" w:id="-1">
     <w:p>
       <w:r>
@@ -63,7 +61,7 @@
 </file>
 
 <file path=word/numbering.xml><?xml version="1.0" encoding="utf-8"?>
-<w:numbering xmlns:wpc="http://schemas.microsoft.com/office/word/2010/wordprocessingCanvas" xmlns:cx="http://schemas.microsoft.com/office/drawing/2014/chartex" xmlns:cx1="http://schemas.microsoft.com/office/drawing/2015/9/8/chartex" xmlns:cx2="http://schemas.microsoft.com/office/drawing/2015/10/21/chartex" xmlns:cx3="http://schemas.microsoft.com/office/drawing/2016/5/9/chartex" xmlns:cx4="http://schemas.microsoft.com/office/drawing/2016/5/10/chartex" xmlns:cx5="http://schemas.microsoft.com/office/drawing/2016/5/11/chartex" xmlns:cx6="http://schemas.microsoft.com/office/drawing/2016/5/12/chartex" xmlns:cx7="http://schemas.microsoft.com/office/drawing/2016/5/13/chartex" xmlns:cx8="http://schemas.microsoft.com/office/drawing/2016/5/14/chartex" xmlns:mc="http://schemas.openxmlformats.org/markup-compatibility/2006" xmlns:aink="http://schemas.microsoft.com/office/drawing/2016/ink" xmlns:am3d="http://schemas.microsoft.com/office/drawing/2017/model3d" xmlns:o="urn:schemas-microsoft-com:office:office" xmlns:r="http://schemas.openxmlformats.org/officeDocument/2006/relationships" xmlns:m="http://schemas.openxmlformats.org/officeDocument/2006/math" xmlns:v="urn:schemas-microsoft-com:vml" xmlns:wp14="http://schemas.microsoft.com/office/word/2010/wordprocessingDrawing" xmlns:wp="http://schemas.openxmlformats.org/drawingml/2006/wordprocessingDrawing" xmlns:w10="urn:schemas-microsoft-com:office:word" xmlns:w="http://schemas.openxmlformats.org/wordprocessingml/2006/main" xmlns:w14="http://schemas.microsoft.com/office/word/2010/wordml" xmlns:w15="http://schemas.microsoft.com/office/word/2012/wordml" xmlns:w16cid="http://schemas.microsoft.com/office/word/2016/wordml/cid" xmlns:w16se="http://schemas.microsoft.com/office/word/2015/wordml/symex" xmlns:wpg="http://schemas.microsoft.com/office/word/2010/wordprocessingGroup" xmlns:wpi="http://schemas.microsoft.com/office/word/2010/wordprocessingInk" xmlns:wne="http://schemas.microsoft.com/office/word/2006/wordml" xmlns:wps="http://schemas.microsoft.com/office/word/2010/wordprocessingShape" mc:Ignorable="w14 w15 w16se w16cid wp14">
+<w:numbering xmlns:wpc="http://schemas.microsoft.com/office/word/2010/wordprocessingCanvas" xmlns:cx="http://schemas.microsoft.com/office/drawing/2014/chartex" xmlns:cx1="http://schemas.microsoft.com/office/drawing/2015/9/8/chartex" xmlns:cx2="http://schemas.microsoft.com/office/drawing/2015/10/21/chartex" xmlns:cx3="http://schemas.microsoft.com/office/drawing/2016/5/9/chartex" xmlns:cx4="http://schemas.microsoft.com/office/drawing/2016/5/10/chartex" xmlns:cx5="http://schemas.microsoft.com/office/drawing/2016/5/11/chartex" xmlns:cx6="http://schemas.microsoft.com/office/drawing/2016/5/12/chartex" xmlns:cx7="http://schemas.microsoft.com/office/drawing/2016/5/13/chartex" xmlns:cx8="http://schemas.microsoft.com/office/drawing/2016/5/14/chartex" xmlns:mc="http://schemas.openxmlformats.org/markup-compatibility/2006" xmlns:aink="http://schemas.microsoft.com/office/drawing/2016/ink" xmlns:am3d="http://schemas.microsoft.com/office/drawing/2017/model3d" xmlns:o="urn:schemas-microsoft-com:office:office" xmlns:oel="http://schemas.microsoft.com/office/2019/extlst" xmlns:r="http://schemas.openxmlformats.org/officeDocument/2006/relationships" xmlns:m="http://schemas.openxmlformats.org/officeDocument/2006/math" xmlns:v="urn:schemas-microsoft-com:vml" xmlns:wp14="http://schemas.microsoft.com/office/word/2010/wordprocessingDrawing" xmlns:wp="http://schemas.openxmlformats.org/drawingml/2006/wordprocessingDrawing" xmlns:w10="urn:schemas-microsoft-com:office:word" xmlns:w="http://schemas.openxmlformats.org/wordprocessingml/2006/main" xmlns:w14="http://schemas.microsoft.com/office/word/2010/wordml" xmlns:w15="http://schemas.microsoft.com/office/word/2012/wordml" xmlns:w16cex="http://schemas.microsoft.com/office/word/2018/wordml/cex" xmlns:w16cid="http://schemas.microsoft.com/office/word/2016/wordml/cid" xmlns:w16="http://schemas.microsoft.com/office/word/2018/wordml" xmlns:w16du="http://schemas.microsoft.com/office/word/2023/wordml/word16du" xmlns:w16sdtdh="http://schemas.microsoft.com/office/word/2020/wordml/sdtdatahash" xmlns:w16sdtfl="http://schemas.microsoft.com/office/word/2024/wordml/sdtformatlock" xmlns:w16se="http://schemas.microsoft.com/office/word/2015/wordml/symex" xmlns:wpg="http://schemas.microsoft.com/office/word/2010/wordprocessingGroup" xmlns:wpi="http://schemas.microsoft.com/office/word/2010/wordprocessingInk" xmlns:wne="http://schemas.microsoft.com/office/word/2006/wordml" xmlns:wps="http://schemas.microsoft.com/office/word/2010/wordprocessingShape" mc:Ignorable="w14 w15 w16se w16cid w16 w16cex w16sdtdh w16sdtfl w16du wp14">
   <w:abstractNum w:abstractNumId="0" w15:restartNumberingAfterBreak="0">
     <w:nsid w:val="EA454B4C"/>
     <w:multiLevelType w:val="multilevel"/>
@@ -674,46 +672,46 @@
       </w:pPr>
     </w:lvl>
   </w:abstractNum>
-  <w:num w:numId="1">
+  <w:num w:numId="1" w16cid:durableId="1982685333">
     <w:abstractNumId w:val="11"/>
   </w:num>
-  <w:num w:numId="2">
+  <w:num w:numId="2" w16cid:durableId="1738437622">
     <w:abstractNumId w:val="11"/>
   </w:num>
-  <w:num w:numId="3">
+  <w:num w:numId="3" w16cid:durableId="1825505740">
     <w:abstractNumId w:val="1"/>
   </w:num>
-  <w:num w:numId="4">
+  <w:num w:numId="4" w16cid:durableId="1111777997">
     <w:abstractNumId w:val="2"/>
   </w:num>
-  <w:num w:numId="5">
+  <w:num w:numId="5" w16cid:durableId="1506896403">
     <w:abstractNumId w:val="3"/>
   </w:num>
-  <w:num w:numId="6">
+  <w:num w:numId="6" w16cid:durableId="647516457">
     <w:abstractNumId w:val="4"/>
   </w:num>
-  <w:num w:numId="7">
+  <w:num w:numId="7" w16cid:durableId="163015354">
     <w:abstractNumId w:val="9"/>
   </w:num>
-  <w:num w:numId="8">
+  <w:num w:numId="8" w16cid:durableId="964965692">
     <w:abstractNumId w:val="5"/>
   </w:num>
-  <w:num w:numId="9">
+  <w:num w:numId="9" w16cid:durableId="1173686534">
     <w:abstractNumId w:val="6"/>
   </w:num>
-  <w:num w:numId="10">
+  <w:num w:numId="10" w16cid:durableId="732773157">
     <w:abstractNumId w:val="7"/>
   </w:num>
-  <w:num w:numId="11">
+  <w:num w:numId="11" w16cid:durableId="1210612310">
     <w:abstractNumId w:val="8"/>
   </w:num>
-  <w:num w:numId="12">
+  <w:num w:numId="12" w16cid:durableId="1496989781">
     <w:abstractNumId w:val="10"/>
   </w:num>
-  <w:num w:numId="13">
+  <w:num w:numId="13" w16cid:durableId="572856691">
     <w:abstractNumId w:val="12"/>
   </w:num>
-  <w:num w:numId="14">
+  <w:num w:numId="14" w16cid:durableId="1393505507">
     <w:abstractNumId w:val="0"/>
     <w:lvlOverride w:ilvl="0">
       <w:startOverride w:val="1"/>
@@ -743,29 +741,29 @@
       <w:startOverride w:val="1"/>
     </w:lvlOverride>
   </w:num>
-  <w:num w:numId="15">
+  <w:num w:numId="15" w16cid:durableId="74674790">
     <w:abstractNumId w:val="13"/>
   </w:num>
-  <w:num w:numId="16">
+  <w:num w:numId="16" w16cid:durableId="33121445">
     <w:abstractNumId w:val="13"/>
   </w:num>
-  <w:num w:numId="17">
+  <w:num w:numId="17" w16cid:durableId="1392266176">
     <w:abstractNumId w:val="13"/>
   </w:num>
-  <w:num w:numId="18">
+  <w:num w:numId="18" w16cid:durableId="325208821">
     <w:abstractNumId w:val="13"/>
   </w:num>
-  <w:num w:numId="19">
+  <w:num w:numId="19" w16cid:durableId="1853953663">
     <w:abstractNumId w:val="13"/>
   </w:num>
-  <w:num w:numId="20">
+  <w:num w:numId="20" w16cid:durableId="1698844446">
     <w:abstractNumId w:val="13"/>
   </w:num>
 </w:numbering>
 </file>
 
 <file path=word/styles.xml><?xml version="1.0" encoding="utf-8"?>
-<w:styles xmlns:mc="http://schemas.openxmlformats.org/markup-compatibility/2006" xmlns:r="http://schemas.openxmlformats.org/officeDocument/2006/relationships" xmlns:w="http://schemas.openxmlformats.org/wordprocessingml/2006/main" xmlns:w14="http://schemas.microsoft.com/office/word/2010/wordml" xmlns:w15="http://schemas.microsoft.com/office/word/2012/wordml" xmlns:w16cid="http://schemas.microsoft.com/office/word/2016/wordml/cid" xmlns:w16se="http://schemas.microsoft.com/office/word/2015/wordml/symex" mc:Ignorable="w14 w15 w16se w16cid">
+<w:styles xmlns:mc="http://schemas.openxmlformats.org/markup-compatibility/2006" xmlns:r="http://schemas.openxmlformats.org/officeDocument/2006/relationships" xmlns:w="http://schemas.openxmlformats.org/wordprocessingml/2006/main" xmlns:w14="http://schemas.microsoft.com/office/word/2010/wordml" xmlns:w15="http://schemas.microsoft.com/office/word/2012/wordml" xmlns:w16cex="http://schemas.microsoft.com/office/word/2018/wordml/cex" xmlns:w16cid="http://schemas.microsoft.com/office/word/2016/wordml/cid" xmlns:w16="http://schemas.microsoft.com/office/word/2018/wordml" xmlns:w16du="http://schemas.microsoft.com/office/word/2023/wordml/word16du" xmlns:w16sdtdh="http://schemas.microsoft.com/office/word/2020/wordml/sdtdatahash" xmlns:w16sdtfl="http://schemas.microsoft.com/office/word/2024/wordml/sdtformatlock" xmlns:w16se="http://schemas.microsoft.com/office/word/2015/wordml/symex" mc:Ignorable="w14 w15 w16se w16cid w16 w16cex w16sdtdh w16sdtfl w16du">
   <w:docDefaults>
     <w:rPrDefault>
       <w:rPr>
@@ -781,7 +779,7 @@
       </w:pPr>
     </w:pPrDefault>
   </w:docDefaults>
-  <w:latentStyles w:defLockedState="0" w:defUIPriority="0" w:defSemiHidden="0" w:defUnhideWhenUsed="0" w:defQFormat="0" w:count="375">
+  <w:latentStyles w:defLockedState="0" w:defUIPriority="0" w:defSemiHidden="0" w:defUnhideWhenUsed="0" w:defQFormat="0" w:count="376">
     <w:lsdException w:name="heading 6" w:semiHidden="1" w:unhideWhenUsed="1"/>
     <w:lsdException w:name="index 3" w:semiHidden="1" w:unhideWhenUsed="1"/>
     <w:lsdException w:name="index 4" w:semiHidden="1" w:unhideWhenUsed="1"/>
@@ -1116,6 +1114,7 @@
     <w:lsdException w:name="Smart Hyperlink" w:semiHidden="1" w:uiPriority="99" w:unhideWhenUsed="1"/>
     <w:lsdException w:name="Hashtag" w:semiHidden="1" w:uiPriority="99" w:unhideWhenUsed="1"/>
     <w:lsdException w:name="Unresolved Mention" w:semiHidden="1" w:uiPriority="99" w:unhideWhenUsed="1"/>
+    <w:lsdException w:name="Smart Link" w:semiHidden="1" w:uiPriority="99" w:unhideWhenUsed="1"/>
   </w:latentStyles>
   <w:style w:type="paragraph" w:default="1" w:styleId="Normal">
     <w:name w:val="Normal"/>
@@ -1851,13 +1850,13 @@
       <w:sz w:val="22"/>
     </w:rPr>
   </w:style>
-  <w:style w:type="paragraph" w:customStyle="1" w:styleId="response">
-    <w:name w:val="response"/>
-    <w:basedOn w:val="BodyText"/>
-    <w:qFormat/>
-    <w:rsid w:val="00F62318"/>
-    <w:rPr>
-      <w:color w:val="4BACC6" w:themeColor="accent5"/>
+  <w:style w:type="character" w:customStyle="1" w:styleId="dim-text">
+    <w:name w:val="dim-text"/>
+    <w:uiPriority w:val="1"/>
+    <w:qFormat/>
+    <w:rsid w:val="00D31CD4"/>
+    <w:rPr>
+      <w:color w:val="7F7F7F" w:themeColor="text1" w:themeTint="80"/>
     </w:rPr>
   </w:style>
   <w:style w:type="character" w:customStyle="1" w:styleId="BodyTextChar">
@@ -1866,12 +1865,24 @@
     <w:link w:val="BodyText"/>
     <w:rsid w:val="00F62318"/>
   </w:style>
-  <w:style w:type="character" w:customStyle="1" w:styleId="response0">
-    <w:name w:val="response"/>
-    <w:basedOn w:val="BodyTextChar"/>
-    <w:rsid w:val="00E60700"/>
-    <w:rPr>
-      <w:color w:val="4BACC6" w:themeColor="accent5"/>
+  <w:style w:type="character" w:customStyle="1" w:styleId="response-text">
+    <w:name w:val="response-text"/>
+    <w:uiPriority w:val="1"/>
+    <w:qFormat/>
+    <w:rsid w:val="00D31CD4"/>
+    <w:rPr>
+      <w:color w:val="000000" w:themeColor="text1"/>
+    </w:rPr>
+  </w:style>
+  <w:style w:type="character" w:styleId="Hashtag">
+    <w:name w:val="Hashtag"/>
+    <w:basedOn w:val="DefaultParagraphFont"/>
+    <w:uiPriority w:val="99"/>
+    <w:unhideWhenUsed/>
+    <w:rsid w:val="006C323C"/>
+    <w:rPr>
+      <w:color w:val="2B579A"/>
+      <w:shd w:val="clear" w:color="auto" w:fill="E1DFDD"/>
     </w:rPr>
   </w:style>
 </w:styles>

</xml_diff>